<commit_message>
Regenerate specification document (latest version)
Rebuilt eSONABE_Specification_SONABEL.docx from updated generate_doc.py.

https://claude.ai/code/session_01KSh39nAGVHGWmzQSa3kBa8
</commit_message>
<xml_diff>
--- a/eSONABE_Specification_SONABEL.docx
+++ b/eSONABE_Specification_SONABEL.docx
@@ -183,7 +183,7 @@
                 <w:color w:val="212121"/>
                 <w:sz w:val="22"/>
               </w:rPr>
-              <w:t>17 March 2026</w:t>
+              <w:t>20 March 2026</w:t>
             </w:r>
           </w:p>
         </w:tc>
@@ -2347,7 +2347,7 @@
         <w:color w:val="999999"/>
         <w:sz w:val="16"/>
       </w:rPr>
-      <w:t>e-SONABE — Document Confidentiel — 17/03/2026 — Propriété de SONABEL. Reproduction interdite sans autorisation.</w:t>
+      <w:t>e-SONABE — Document Confidentiel — 20/03/2026 — Propriété de SONABEL. Reproduction interdite sans autorisation.</w:t>
     </w:r>
   </w:p>
 </w:ftr>

</xml_diff>